<commit_message>
Changes to insure wide enough door opening
</commit_message>
<xml_diff>
--- a/Front_Wall/front_wall_ada.docx
+++ b/Front_Wall/front_wall_ada.docx
@@ -676,7 +676,19 @@
         <w:t xml:space="preserve"> </w:t>
       </w:r>
       <w:r>
-        <w:t xml:space="preserve">from the side opposite the window.</w:t>
+        <w:t xml:space="preserve">from the side opposite the window. If clamping does not make the</w:t>
+      </w:r>
+      <w:r>
+        <w:t xml:space="preserve"> </w:t>
+      </w:r>
+      <w:r>
+        <w:t xml:space="preserve">joint tight, use 3” brown screws to force the two studs together</w:t>
+      </w:r>
+      <w:r>
+        <w:t xml:space="preserve"> </w:t>
+      </w:r>
+      <w:r>
+        <w:t xml:space="preserve">below the window.</w:t>
       </w:r>
     </w:p>
     <w:p>
@@ -887,7 +899,7 @@
         <w:t xml:space="preserve"> </w:t>
       </w:r>
       <w:r>
-        <w:t xml:space="preserve">and two header blocks and a plywood spacer above the door opening.</w:t>
+        <w:t xml:space="preserve">and two header blocks and a plywood spacer between them above the door opening.</w:t>
       </w:r>
     </w:p>
     <w:p>
@@ -911,7 +923,7 @@
         <w:t xml:space="preserve"> </w:t>
       </w:r>
       <w:r>
-        <w:t xml:space="preserve">the blocks. Do not nail into the ends of either of the studs.</w:t>
+        <w:t xml:space="preserve">the blocks.</w:t>
       </w:r>
     </w:p>
     <w:p>
@@ -923,7 +935,17 @@
         </w:numPr>
       </w:pPr>
       <w:r>
-        <w:t xml:space="preserve">Do not put nails at the ends of the studs on either side of the door</w:t>
+        <w:rPr>
+          <w:b/>
+          <w:bCs/>
+        </w:rPr>
+        <w:t xml:space="preserve">Do not</w:t>
+      </w:r>
+      <w:r>
+        <w:t xml:space="preserve"> </w:t>
+      </w:r>
+      <w:r>
+        <w:t xml:space="preserve">nail into the ends of the studs on either side of the door</w:t>
       </w:r>
       <w:r>
         <w:t xml:space="preserve"> </w:t>
@@ -1035,7 +1057,7 @@
         </w:numPr>
       </w:pPr>
       <w:r>
-        <w:t xml:space="preserve">Clamp the 3 studs in the center of the wall together, and nail as shown:</w:t>
+        <w:t xml:space="preserve">Clamp the 3 studs in the center of the wall together, being certain that there is no gap, and nail as shown:</w:t>
       </w:r>
       <w:r>
         <w:br/>
@@ -1049,6 +1071,24 @@
       <w:r>
         <w:t xml:space="preserve">— 3 nails from the door side evenly spaced along the length of the stud.</w:t>
       </w:r>
+      <w:r>
+        <w:t xml:space="preserve"> </w:t>
+      </w:r>
+      <w:r>
+        <w:t xml:space="preserve">If there is any gap between the new stud and the two closer to the window,</w:t>
+      </w:r>
+      <w:r>
+        <w:t xml:space="preserve"> </w:t>
+      </w:r>
+      <w:r>
+        <w:t xml:space="preserve">drive a 3” brown screw into the stud nearest the door and tighten it to remove</w:t>
+      </w:r>
+      <w:r>
+        <w:t xml:space="preserve"> </w:t>
+      </w:r>
+      <w:r>
+        <w:t xml:space="preserve">that gap.</w:t>
+      </w:r>
     </w:p>
     <w:p>
       <w:pPr>
@@ -1071,7 +1111,7 @@
         <w:t xml:space="preserve"> </w:t>
       </w:r>
       <w:r>
-        <w:t xml:space="preserve">the bottom block. Clamp the block between the two studs, and nail</w:t>
+        <w:t xml:space="preserve">the bottom block. Clamp each block between the two studs, and nail</w:t>
       </w:r>
       <w:r>
         <w:t xml:space="preserve"> </w:t>
@@ -2810,7 +2850,7 @@
       <w:pgSz w:code="1" w:h="15840" w:w="12240"/>
       <w:pgMar w:bottom="1440" w:footer="708" w:gutter="0" w:header="708" w:left="1440" w:right="1440" w:top="1440"/>
       <w:cols w:space="708"/>
-      <w:docGrid w:linePitch="360"/>
+      <w:docGrid w:linePitch="381"/>
     </w:sectPr>
   </w:body>
 </w:document>
@@ -2836,7 +2876,7 @@
     <w:pPr>
       <w:pStyle w:val="Footer"/>
       <w:pBdr>
-        <w:top w:val="single" w:sz="4" w:space="1" w:color="BFBFBF" w:themeColor="background1" w:themeShade="BF"/>
+        <w:top w:val="single" w:sz="4" w:space="1" w:color="auto"/>
       </w:pBdr>
       <w:rPr>
         <w:sz w:val="22"/>
@@ -2853,6 +2893,12 @@
         <w:sz w:val="22"/>
       </w:rPr>
       <w:ptab w:relativeTo="margin" w:alignment="center" w:leader="none"/>
+    </w:r>
+    <w:r>
+      <w:rPr>
+        <w:sz w:val="22"/>
+      </w:rPr>
+      <w:t xml:space="preserve"> </w:t>
     </w:r>
     <w:r>
       <w:rPr>
@@ -2877,13 +2923,19 @@
         <w:noProof/>
         <w:sz w:val="22"/>
       </w:rPr>
-      <w:t>30 January 2025</w:t>
+      <w:t>12 March 2025</w:t>
     </w:r>
     <w:r>
       <w:rPr>
         <w:sz w:val="22"/>
       </w:rPr>
       <w:fldChar w:fldCharType="end"/>
+    </w:r>
+    <w:r>
+      <w:rPr>
+        <w:sz w:val="22"/>
+      </w:rPr>
+      <w:t xml:space="preserve"> </w:t>
     </w:r>
     <w:r>
       <w:rPr>
@@ -2918,7 +2970,6 @@
     </w:r>
     <w:r>
       <w:rPr>
-        <w:noProof/>
         <w:sz w:val="22"/>
       </w:rPr>
       <w:fldChar w:fldCharType="end"/>
@@ -2991,10 +3042,11 @@
   <w:abstractNum w15:restartNumberingAfterBreak="0" w:abstractNumId="0">
     <w:nsid w:val="5BCE4232"/>
     <w:multiLevelType w:val="hybridMultilevel"/>
-    <w:tmpl w:val="622EFD06"/>
-    <w:lvl w:ilvl="0" w:tplc="0C090001">
+    <w:tmpl w:val="C14AE192"/>
+    <w:lvl w:ilvl="0" w:tplc="4A0AC008">
       <w:start w:val="1"/>
       <w:numFmt w:val="bullet"/>
+      <w:pStyle w:val="ListParagraph"/>
       <w:lvlText w:val=""/>
       <w:lvlJc w:val="left"/>
       <w:pPr>
@@ -3365,7 +3417,7 @@
       </w:pPr>
     </w:lvl>
   </w:abstractNum>
-  <w:num w16cid:durableId="1603538387" w:numId="1">
+  <w:num w16cid:durableId="101804748" w:numId="1">
     <w:abstractNumId w:val="0"/>
   </w:num>
   <w:num w:numId="1000">
@@ -3841,7 +3893,7 @@
   <w:style w:default="1" w:styleId="Normal" w:type="paragraph">
     <w:name w:val="Normal"/>
     <w:qFormat/>
-    <w:rsid w:val="0033722B"/>
+    <w:rsid w:val="00682500"/>
     <w:rPr>
       <w:sz w:val="28"/>
     </w:rPr>
@@ -3880,7 +3932,7 @@
     <w:uiPriority w:val="9"/>
     <w:unhideWhenUsed/>
     <w:qFormat/>
-    <w:rsid w:val="00F14C3E"/>
+    <w:rsid w:val="00B467BA"/>
     <w:pPr>
       <w:keepNext/>
       <w:keepLines/>
@@ -3904,11 +3956,11 @@
     <w:uiPriority w:val="9"/>
     <w:unhideWhenUsed/>
     <w:qFormat/>
-    <w:rsid w:val="005B3D4E"/>
+    <w:rsid w:val="001716AF"/>
     <w:pPr>
       <w:keepNext/>
       <w:keepLines/>
-      <w:spacing w:after="0" w:before="40"/>
+      <w:spacing w:after="0" w:before="120"/>
       <w:outlineLvl w:val="2"/>
     </w:pPr>
     <w:rPr>
@@ -3926,18 +3978,17 @@
     <w:uiPriority w:val="9"/>
     <w:unhideWhenUsed/>
     <w:qFormat/>
-    <w:rsid w:val="005B3D4E"/>
+    <w:rsid w:val="001716AF"/>
     <w:pPr>
       <w:keepNext/>
       <w:keepLines/>
-      <w:spacing w:after="0" w:before="40"/>
+      <w:spacing w:after="0"/>
       <w:outlineLvl w:val="3"/>
     </w:pPr>
     <w:rPr>
-      <w:rFonts w:asciiTheme="majorHAnsi" w:cstheme="majorBidi" w:eastAsiaTheme="majorEastAsia" w:hAnsiTheme="majorHAnsi"/>
-      <w:i/>
+      <w:rFonts w:ascii="Arial" w:cs="Arial" w:eastAsiaTheme="majorEastAsia" w:hAnsi="Arial"/>
+      <w:bCs/>
       <w:iCs/>
-      <w:color w:themeColor="accent1" w:themeShade="BF" w:val="365F91"/>
     </w:rPr>
   </w:style>
   <w:style w:default="1" w:styleId="DefaultParagraphFont" w:type="character">
@@ -3973,7 +4024,7 @@
     <w:link w:val="HeaderChar"/>
     <w:uiPriority w:val="99"/>
     <w:unhideWhenUsed/>
-    <w:rsid w:val="00E043FD"/>
+    <w:rsid w:val="00037B15"/>
     <w:pPr>
       <w:tabs>
         <w:tab w:pos="4513" w:val="center"/>
@@ -3988,6 +4039,9 @@
     <w:link w:val="Header"/>
     <w:uiPriority w:val="99"/>
     <w:rsid w:val="00E043FD"/>
+    <w:rPr>
+      <w:sz w:val="28"/>
+    </w:rPr>
   </w:style>
   <w:style w:styleId="Footer" w:type="paragraph">
     <w:name w:val="footer"/>
@@ -3995,7 +4049,7 @@
     <w:link w:val="FooterChar"/>
     <w:uiPriority w:val="99"/>
     <w:unhideWhenUsed/>
-    <w:rsid w:val="00E043FD"/>
+    <w:rsid w:val="00037B15"/>
     <w:pPr>
       <w:tabs>
         <w:tab w:pos="4513" w:val="center"/>
@@ -4010,6 +4064,9 @@
     <w:link w:val="Footer"/>
     <w:uiPriority w:val="99"/>
     <w:rsid w:val="00E043FD"/>
+    <w:rPr>
+      <w:sz w:val="28"/>
+    </w:rPr>
   </w:style>
   <w:style w:customStyle="1" w:styleId="3CBD5A742C28424DA5172AD252E32316" w:type="paragraph">
     <w:name w:val="3CBD5A742C28424DA5172AD252E32316"/>
@@ -4108,7 +4165,7 @@
     <w:basedOn w:val="DefaultParagraphFont"/>
     <w:link w:val="Heading2"/>
     <w:uiPriority w:val="9"/>
-    <w:rsid w:val="00F14C3E"/>
+    <w:rsid w:val="00B467BA"/>
     <w:rPr>
       <w:rFonts w:cstheme="minorHAnsi" w:eastAsiaTheme="majorEastAsia"/>
       <w:b/>
@@ -4121,11 +4178,15 @@
   <w:style w:styleId="ListParagraph" w:type="paragraph">
     <w:name w:val="List Paragraph"/>
     <w:basedOn w:val="Normal"/>
+    <w:link w:val="ListParagraphChar"/>
     <w:uiPriority w:val="34"/>
     <w:qFormat/>
-    <w:rsid w:val="0085261D"/>
+    <w:rsid w:val="002E72C0"/>
     <w:pPr>
-      <w:ind w:left="720"/>
+      <w:numPr>
+        <w:numId w:val="1"/>
+      </w:numPr>
+      <w:spacing w:after="120"/>
       <w:contextualSpacing/>
     </w:pPr>
   </w:style>
@@ -4134,7 +4195,7 @@
     <w:basedOn w:val="DefaultParagraphFont"/>
     <w:link w:val="Heading3"/>
     <w:uiPriority w:val="9"/>
-    <w:rsid w:val="005B3D4E"/>
+    <w:rsid w:val="001716AF"/>
     <w:rPr>
       <w:rFonts w:ascii="Arial" w:cstheme="majorBidi" w:eastAsiaTheme="majorEastAsia" w:hAnsi="Arial"/>
       <w:color w:themeColor="accent1" w:themeShade="7F" w:val="243F60"/>
@@ -4147,22 +4208,61 @@
     <w:basedOn w:val="DefaultParagraphFont"/>
     <w:link w:val="Heading4"/>
     <w:uiPriority w:val="9"/>
-    <w:rsid w:val="005B3D4E"/>
-    <w:rPr>
-      <w:rFonts w:asciiTheme="majorHAnsi" w:cstheme="majorBidi" w:eastAsiaTheme="majorEastAsia" w:hAnsiTheme="majorHAnsi"/>
-      <w:i/>
+    <w:rsid w:val="001716AF"/>
+    <w:rPr>
+      <w:rFonts w:ascii="Arial" w:cs="Arial" w:eastAsiaTheme="majorEastAsia" w:hAnsi="Arial"/>
+      <w:bCs/>
       <w:iCs/>
-      <w:color w:themeColor="accent1" w:themeShade="BF" w:val="365F91"/>
+      <w:sz w:val="28"/>
     </w:rPr>
   </w:style>
   <w:style w:styleId="NoSpacing" w:type="paragraph">
     <w:name w:val="No Spacing"/>
     <w:uiPriority w:val="1"/>
     <w:qFormat/>
-    <w:rsid w:val="0033722B"/>
+    <w:rsid w:val="00037B15"/>
     <w:pPr>
       <w:spacing w:after="0" w:line="240" w:lineRule="auto"/>
     </w:pPr>
+    <w:rPr>
+      <w:sz w:val="28"/>
+    </w:rPr>
+  </w:style>
+  <w:style w:styleId="Revision" w:type="paragraph">
+    <w:name w:val="Revision"/>
+    <w:hidden/>
+    <w:uiPriority w:val="99"/>
+    <w:semiHidden/>
+    <w:rsid w:val="00037B15"/>
+    <w:pPr>
+      <w:spacing w:after="0" w:line="240" w:lineRule="auto"/>
+    </w:pPr>
+  </w:style>
+  <w:style w:customStyle="1" w:styleId="Bulleted" w:type="paragraph">
+    <w:name w:val="Bulleted"/>
+    <w:basedOn w:val="ListParagraph"/>
+    <w:link w:val="BulletedChar"/>
+    <w:qFormat/>
+    <w:rsid w:val="006E24A1"/>
+    <w:pPr>
+      <w:spacing w:after="0"/>
+    </w:pPr>
+  </w:style>
+  <w:style w:customStyle="1" w:styleId="ListParagraphChar" w:type="character">
+    <w:name w:val="List Paragraph Char"/>
+    <w:basedOn w:val="DefaultParagraphFont"/>
+    <w:link w:val="ListParagraph"/>
+    <w:uiPriority w:val="34"/>
+    <w:rsid w:val="006E24A1"/>
+    <w:rPr>
+      <w:sz w:val="28"/>
+    </w:rPr>
+  </w:style>
+  <w:style w:customStyle="1" w:styleId="BulletedChar" w:type="character">
+    <w:name w:val="Bulleted Char"/>
+    <w:basedOn w:val="ListParagraphChar"/>
+    <w:link w:val="Bulleted"/>
+    <w:rsid w:val="006E24A1"/>
     <w:rPr>
       <w:sz w:val="28"/>
     </w:rPr>

</xml_diff>